<commit_message>
Add sibling-family test results and region breakdown to the lance findings report
Sibling-family (between-family variance) test in the backcrosses, old v2
human points vs v1.4 labels: equal where both protocols measure the same
anatomy; the old protocol's extra family signal sits in its Dorsal fork
cluster and heel points, which may be heritable or a digitizing-batch
effect. Report gains Section 4.3 and matching summary/recommendations; fixes
the size correction in sibling_family_test.R.

Co-Authored-By: Claude Opus 5.5 <noreply@anthropic.com>
</commit_message>
<xml_diff>
--- a/genai_lance_landmarking/analysis/Protocol_Comparison_Findings.docx
+++ b/genai_lance_landmarking/analysis/Protocol_Comparison_Findings.docx
@@ -203,6 +203,25 @@
     </w:p>
     <w:p>
       <w:pPr>
+        <w:pStyle w:val="ListBullet"/>
+      </w:pPr>
+      <w:r>
+        <w:rPr>
+          <w:b/>
+          <w:i w:val="0"/>
+        </w:rPr>
+        <w:t>But it has not been shown to detect more biological variation.</w:t>
+      </w:r>
+      <w:r>
+        <w:rPr>
+          <w:b w:val="0"/>
+          <w:i w:val="0"/>
+        </w:rPr>
+        <w:t xml:space="preserve"> In a sibling-family test (Section 4.3) the new protocol captured the same family resemblance as the old one where both measure the same anatomy, and less overall, because the old protocol's family signal sits in its least reliable points (Dorsal split point cluster, heel), which may reflect heritable variation or digitizing-batch effects.</w:t>
+      </w:r>
+    </w:p>
+    <w:p>
+      <w:pPr>
         <w:pStyle w:val="Heading1"/>
       </w:pPr>
       <w:r>
@@ -12700,6 +12719,1860 @@
     </w:p>
     <w:p>
       <w:pPr>
+        <w:pStyle w:val="Heading2"/>
+      </w:pPr>
+      <w:r>
+        <w:t>4.3 Sibling-family test: heritable variation in the backcrosses</w:t>
+      </w:r>
+    </w:p>
+    <w:p>
+      <w:r>
+        <w:rPr>
+          <w:b w:val="0"/>
+          <w:i w:val="0"/>
+        </w:rPr>
+        <w:t>If a protocol captures more heritable variation, siblings should resemble each other more under it. For backcross individuals in families of three or more (Right 174 in 18 families, Left 162 in 17, Dorsal 146 in 15), the share of shape and size variance lying between sibling families was computed for each protocol on the same individuals (old = the original human points; new = v1.4 labels), after removing size and cross type, with a cluster bootstrap over families.</w:t>
+      </w:r>
+    </w:p>
+    <w:tbl>
+      <w:tblPr>
+        <w:tblStyle w:val="TableGrid"/>
+        <w:tblW w:type="auto" w:w="0"/>
+        <w:jc w:val="center"/>
+        <w:tblLook w:firstColumn="1" w:firstRow="1" w:lastColumn="0" w:lastRow="0" w:noHBand="0" w:noVBand="1" w:val="04A0"/>
+      </w:tblPr>
+      <w:tblGrid>
+        <w:gridCol w:w="1337"/>
+        <w:gridCol w:w="1337"/>
+        <w:gridCol w:w="1337"/>
+        <w:gridCol w:w="1337"/>
+        <w:gridCol w:w="1337"/>
+        <w:gridCol w:w="1337"/>
+        <w:gridCol w:w="1337"/>
+      </w:tblGrid>
+      <w:tr>
+        <w:tc>
+          <w:tcPr>
+            <w:tcW w:type="dxa" w:w="864"/>
+            <w:shd w:val="clear" w:color="auto" w:fill="D9E2F3"/>
+          </w:tcPr>
+          <w:p>
+            <w:r>
+              <w:rPr>
+                <w:sz w:val="19"/>
+              </w:rPr>
+            </w:r>
+            <w:r>
+              <w:rPr>
+                <w:b/>
+                <w:sz w:val="19"/>
+              </w:rPr>
+              <w:t>Face</w:t>
+            </w:r>
+          </w:p>
+        </w:tc>
+        <w:tc>
+          <w:tcPr>
+            <w:tcW w:type="dxa" w:w="864"/>
+            <w:shd w:val="clear" w:color="auto" w:fill="D9E2F3"/>
+          </w:tcPr>
+          <w:p>
+            <w:r>
+              <w:rPr>
+                <w:sz w:val="19"/>
+              </w:rPr>
+            </w:r>
+            <w:r>
+              <w:rPr>
+                <w:b/>
+                <w:sz w:val="19"/>
+              </w:rPr>
+              <w:t>Measure</w:t>
+            </w:r>
+          </w:p>
+        </w:tc>
+        <w:tc>
+          <w:tcPr>
+            <w:tcW w:type="dxa" w:w="576"/>
+            <w:shd w:val="clear" w:color="auto" w:fill="D9E2F3"/>
+          </w:tcPr>
+          <w:p>
+            <w:r>
+              <w:rPr>
+                <w:sz w:val="19"/>
+              </w:rPr>
+            </w:r>
+            <w:r>
+              <w:rPr>
+                <w:b/>
+                <w:sz w:val="19"/>
+              </w:rPr>
+              <w:t>n</w:t>
+            </w:r>
+          </w:p>
+        </w:tc>
+        <w:tc>
+          <w:tcPr>
+            <w:tcW w:type="dxa" w:w="864"/>
+            <w:shd w:val="clear" w:color="auto" w:fill="D9E2F3"/>
+          </w:tcPr>
+          <w:p>
+            <w:r>
+              <w:rPr>
+                <w:sz w:val="19"/>
+              </w:rPr>
+            </w:r>
+            <w:r>
+              <w:rPr>
+                <w:b/>
+                <w:sz w:val="19"/>
+              </w:rPr>
+              <w:t>Families</w:t>
+            </w:r>
+          </w:p>
+        </w:tc>
+        <w:tc>
+          <w:tcPr>
+            <w:tcW w:type="dxa" w:w="2016"/>
+            <w:shd w:val="clear" w:color="auto" w:fill="D9E2F3"/>
+          </w:tcPr>
+          <w:p>
+            <w:r>
+              <w:rPr>
+                <w:sz w:val="19"/>
+              </w:rPr>
+            </w:r>
+            <w:r>
+              <w:rPr>
+                <w:b/>
+                <w:sz w:val="19"/>
+              </w:rPr>
+              <w:t>Old [95%]</w:t>
+            </w:r>
+          </w:p>
+        </w:tc>
+        <w:tc>
+          <w:tcPr>
+            <w:tcW w:type="dxa" w:w="2016"/>
+            <w:shd w:val="clear" w:color="auto" w:fill="D9E2F3"/>
+          </w:tcPr>
+          <w:p>
+            <w:r>
+              <w:rPr>
+                <w:sz w:val="19"/>
+              </w:rPr>
+            </w:r>
+            <w:r>
+              <w:rPr>
+                <w:b/>
+                <w:sz w:val="19"/>
+              </w:rPr>
+              <w:t>New [95%]</w:t>
+            </w:r>
+          </w:p>
+        </w:tc>
+        <w:tc>
+          <w:tcPr>
+            <w:tcW w:type="dxa" w:w="2160"/>
+            <w:shd w:val="clear" w:color="auto" w:fill="D9E2F3"/>
+          </w:tcPr>
+          <w:p>
+            <w:r>
+              <w:rPr>
+                <w:sz w:val="19"/>
+              </w:rPr>
+            </w:r>
+            <w:r>
+              <w:rPr>
+                <w:b/>
+                <w:sz w:val="19"/>
+              </w:rPr>
+              <w:t>New − old [95%]</w:t>
+            </w:r>
+          </w:p>
+        </w:tc>
+      </w:tr>
+      <w:tr>
+        <w:tc>
+          <w:tcPr>
+            <w:tcW w:type="dxa" w:w="864"/>
+          </w:tcPr>
+          <w:p>
+            <w:r>
+              <w:rPr>
+                <w:sz w:val="19"/>
+              </w:rPr>
+              <w:t>Right</w:t>
+            </w:r>
+          </w:p>
+        </w:tc>
+        <w:tc>
+          <w:tcPr>
+            <w:tcW w:type="dxa" w:w="864"/>
+          </w:tcPr>
+          <w:p>
+            <w:r>
+              <w:rPr>
+                <w:sz w:val="19"/>
+              </w:rPr>
+              <w:t>shape</w:t>
+            </w:r>
+          </w:p>
+        </w:tc>
+        <w:tc>
+          <w:tcPr>
+            <w:tcW w:type="dxa" w:w="576"/>
+          </w:tcPr>
+          <w:p>
+            <w:r>
+              <w:rPr>
+                <w:sz w:val="19"/>
+              </w:rPr>
+              <w:t>174</w:t>
+            </w:r>
+          </w:p>
+        </w:tc>
+        <w:tc>
+          <w:tcPr>
+            <w:tcW w:type="dxa" w:w="864"/>
+          </w:tcPr>
+          <w:p>
+            <w:r>
+              <w:rPr>
+                <w:sz w:val="19"/>
+              </w:rPr>
+              <w:t>18</w:t>
+            </w:r>
+          </w:p>
+        </w:tc>
+        <w:tc>
+          <w:tcPr>
+            <w:tcW w:type="dxa" w:w="2016"/>
+          </w:tcPr>
+          <w:p>
+            <w:r>
+              <w:rPr>
+                <w:sz w:val="19"/>
+              </w:rPr>
+              <w:t>0.046 [0.011, 0.081]</w:t>
+            </w:r>
+          </w:p>
+        </w:tc>
+        <w:tc>
+          <w:tcPr>
+            <w:tcW w:type="dxa" w:w="2016"/>
+          </w:tcPr>
+          <w:p>
+            <w:r>
+              <w:rPr>
+                <w:sz w:val="19"/>
+              </w:rPr>
+              <w:t>0.049 [0.018, 0.077]</w:t>
+            </w:r>
+          </w:p>
+        </w:tc>
+        <w:tc>
+          <w:tcPr>
+            <w:tcW w:type="dxa" w:w="2160"/>
+          </w:tcPr>
+          <w:p>
+            <w:r>
+              <w:rPr>
+                <w:sz w:val="19"/>
+              </w:rPr>
+              <w:t>0.003 [-0.014, 0.020]</w:t>
+            </w:r>
+          </w:p>
+        </w:tc>
+      </w:tr>
+      <w:tr>
+        <w:tc>
+          <w:tcPr>
+            <w:tcW w:type="dxa" w:w="864"/>
+          </w:tcPr>
+          <w:p>
+            <w:r>
+              <w:rPr>
+                <w:sz w:val="19"/>
+              </w:rPr>
+              <w:t>Right</w:t>
+            </w:r>
+          </w:p>
+        </w:tc>
+        <w:tc>
+          <w:tcPr>
+            <w:tcW w:type="dxa" w:w="864"/>
+          </w:tcPr>
+          <w:p>
+            <w:r>
+              <w:rPr>
+                <w:sz w:val="19"/>
+              </w:rPr>
+              <w:t>size</w:t>
+            </w:r>
+          </w:p>
+        </w:tc>
+        <w:tc>
+          <w:tcPr>
+            <w:tcW w:type="dxa" w:w="576"/>
+          </w:tcPr>
+          <w:p>
+            <w:r>
+              <w:rPr>
+                <w:sz w:val="19"/>
+              </w:rPr>
+              <w:t>174</w:t>
+            </w:r>
+          </w:p>
+        </w:tc>
+        <w:tc>
+          <w:tcPr>
+            <w:tcW w:type="dxa" w:w="864"/>
+          </w:tcPr>
+          <w:p>
+            <w:r>
+              <w:rPr>
+                <w:sz w:val="19"/>
+              </w:rPr>
+              <w:t>18</w:t>
+            </w:r>
+          </w:p>
+        </w:tc>
+        <w:tc>
+          <w:tcPr>
+            <w:tcW w:type="dxa" w:w="2016"/>
+          </w:tcPr>
+          <w:p>
+            <w:r>
+              <w:rPr>
+                <w:sz w:val="19"/>
+              </w:rPr>
+              <w:t>0.174 [0.009, 0.328]</w:t>
+            </w:r>
+          </w:p>
+        </w:tc>
+        <w:tc>
+          <w:tcPr>
+            <w:tcW w:type="dxa" w:w="2016"/>
+          </w:tcPr>
+          <w:p>
+            <w:r>
+              <w:rPr>
+                <w:sz w:val="19"/>
+              </w:rPr>
+              <w:t>0.137 [0.000, 0.268]</w:t>
+            </w:r>
+          </w:p>
+        </w:tc>
+        <w:tc>
+          <w:tcPr>
+            <w:tcW w:type="dxa" w:w="2160"/>
+          </w:tcPr>
+          <w:p>
+            <w:r>
+              <w:rPr>
+                <w:sz w:val="19"/>
+              </w:rPr>
+              <w:t>-0.037 [-0.075, 0.005]</w:t>
+            </w:r>
+          </w:p>
+        </w:tc>
+      </w:tr>
+      <w:tr>
+        <w:tc>
+          <w:tcPr>
+            <w:tcW w:type="dxa" w:w="864"/>
+          </w:tcPr>
+          <w:p>
+            <w:r>
+              <w:rPr>
+                <w:sz w:val="19"/>
+              </w:rPr>
+              <w:t>Left</w:t>
+            </w:r>
+          </w:p>
+        </w:tc>
+        <w:tc>
+          <w:tcPr>
+            <w:tcW w:type="dxa" w:w="864"/>
+          </w:tcPr>
+          <w:p>
+            <w:r>
+              <w:rPr>
+                <w:sz w:val="19"/>
+              </w:rPr>
+              <w:t>shape</w:t>
+            </w:r>
+          </w:p>
+        </w:tc>
+        <w:tc>
+          <w:tcPr>
+            <w:tcW w:type="dxa" w:w="576"/>
+          </w:tcPr>
+          <w:p>
+            <w:r>
+              <w:rPr>
+                <w:sz w:val="19"/>
+              </w:rPr>
+              <w:t>162</w:t>
+            </w:r>
+          </w:p>
+        </w:tc>
+        <w:tc>
+          <w:tcPr>
+            <w:tcW w:type="dxa" w:w="864"/>
+          </w:tcPr>
+          <w:p>
+            <w:r>
+              <w:rPr>
+                <w:sz w:val="19"/>
+              </w:rPr>
+              <w:t>17</w:t>
+            </w:r>
+          </w:p>
+        </w:tc>
+        <w:tc>
+          <w:tcPr>
+            <w:tcW w:type="dxa" w:w="2016"/>
+          </w:tcPr>
+          <w:p>
+            <w:r>
+              <w:rPr>
+                <w:sz w:val="19"/>
+              </w:rPr>
+              <w:t>0.087 [0.033, 0.128]</w:t>
+            </w:r>
+          </w:p>
+        </w:tc>
+        <w:tc>
+          <w:tcPr>
+            <w:tcW w:type="dxa" w:w="2016"/>
+          </w:tcPr>
+          <w:p>
+            <w:r>
+              <w:rPr>
+                <w:sz w:val="19"/>
+              </w:rPr>
+              <w:t>0.044 [0.006, 0.083]</w:t>
+            </w:r>
+          </w:p>
+        </w:tc>
+        <w:tc>
+          <w:tcPr>
+            <w:tcW w:type="dxa" w:w="2160"/>
+          </w:tcPr>
+          <w:p>
+            <w:r>
+              <w:rPr>
+                <w:sz w:val="19"/>
+              </w:rPr>
+              <w:t>-0.041 [-0.067, -0.009]</w:t>
+            </w:r>
+          </w:p>
+        </w:tc>
+      </w:tr>
+      <w:tr>
+        <w:tc>
+          <w:tcPr>
+            <w:tcW w:type="dxa" w:w="864"/>
+          </w:tcPr>
+          <w:p>
+            <w:r>
+              <w:rPr>
+                <w:sz w:val="19"/>
+              </w:rPr>
+              <w:t>Left</w:t>
+            </w:r>
+          </w:p>
+        </w:tc>
+        <w:tc>
+          <w:tcPr>
+            <w:tcW w:type="dxa" w:w="864"/>
+          </w:tcPr>
+          <w:p>
+            <w:r>
+              <w:rPr>
+                <w:sz w:val="19"/>
+              </w:rPr>
+              <w:t>size</w:t>
+            </w:r>
+          </w:p>
+        </w:tc>
+        <w:tc>
+          <w:tcPr>
+            <w:tcW w:type="dxa" w:w="576"/>
+          </w:tcPr>
+          <w:p>
+            <w:r>
+              <w:rPr>
+                <w:sz w:val="19"/>
+              </w:rPr>
+              <w:t>162</w:t>
+            </w:r>
+          </w:p>
+        </w:tc>
+        <w:tc>
+          <w:tcPr>
+            <w:tcW w:type="dxa" w:w="864"/>
+          </w:tcPr>
+          <w:p>
+            <w:r>
+              <w:rPr>
+                <w:sz w:val="19"/>
+              </w:rPr>
+              <w:t>17</w:t>
+            </w:r>
+          </w:p>
+        </w:tc>
+        <w:tc>
+          <w:tcPr>
+            <w:tcW w:type="dxa" w:w="2016"/>
+          </w:tcPr>
+          <w:p>
+            <w:r>
+              <w:rPr>
+                <w:sz w:val="19"/>
+              </w:rPr>
+              <w:t>0.262 [0.098, 0.430]</w:t>
+            </w:r>
+          </w:p>
+        </w:tc>
+        <w:tc>
+          <w:tcPr>
+            <w:tcW w:type="dxa" w:w="2016"/>
+          </w:tcPr>
+          <w:p>
+            <w:r>
+              <w:rPr>
+                <w:sz w:val="19"/>
+              </w:rPr>
+              <w:t>0.281 [0.098, 0.430]</w:t>
+            </w:r>
+          </w:p>
+        </w:tc>
+        <w:tc>
+          <w:tcPr>
+            <w:tcW w:type="dxa" w:w="2160"/>
+          </w:tcPr>
+          <w:p>
+            <w:r>
+              <w:rPr>
+                <w:sz w:val="19"/>
+              </w:rPr>
+              <w:t>0.016 [-0.066, 0.087]</w:t>
+            </w:r>
+          </w:p>
+        </w:tc>
+      </w:tr>
+      <w:tr>
+        <w:tc>
+          <w:tcPr>
+            <w:tcW w:type="dxa" w:w="864"/>
+          </w:tcPr>
+          <w:p>
+            <w:r>
+              <w:rPr>
+                <w:sz w:val="19"/>
+              </w:rPr>
+              <w:t>Dorsal</w:t>
+            </w:r>
+          </w:p>
+        </w:tc>
+        <w:tc>
+          <w:tcPr>
+            <w:tcW w:type="dxa" w:w="864"/>
+          </w:tcPr>
+          <w:p>
+            <w:r>
+              <w:rPr>
+                <w:sz w:val="19"/>
+              </w:rPr>
+              <w:t>shape</w:t>
+            </w:r>
+          </w:p>
+        </w:tc>
+        <w:tc>
+          <w:tcPr>
+            <w:tcW w:type="dxa" w:w="576"/>
+          </w:tcPr>
+          <w:p>
+            <w:r>
+              <w:rPr>
+                <w:sz w:val="19"/>
+              </w:rPr>
+              <w:t>146</w:t>
+            </w:r>
+          </w:p>
+        </w:tc>
+        <w:tc>
+          <w:tcPr>
+            <w:tcW w:type="dxa" w:w="864"/>
+          </w:tcPr>
+          <w:p>
+            <w:r>
+              <w:rPr>
+                <w:sz w:val="19"/>
+              </w:rPr>
+              <w:t>15</w:t>
+            </w:r>
+          </w:p>
+        </w:tc>
+        <w:tc>
+          <w:tcPr>
+            <w:tcW w:type="dxa" w:w="2016"/>
+          </w:tcPr>
+          <w:p>
+            <w:r>
+              <w:rPr>
+                <w:sz w:val="19"/>
+              </w:rPr>
+              <w:t>0.192 [0.120, 0.261]</w:t>
+            </w:r>
+          </w:p>
+        </w:tc>
+        <w:tc>
+          <w:tcPr>
+            <w:tcW w:type="dxa" w:w="2016"/>
+          </w:tcPr>
+          <w:p>
+            <w:r>
+              <w:rPr>
+                <w:sz w:val="19"/>
+              </w:rPr>
+              <w:t>0.039 [0.000, 0.073]</w:t>
+            </w:r>
+          </w:p>
+        </w:tc>
+        <w:tc>
+          <w:tcPr>
+            <w:tcW w:type="dxa" w:w="2160"/>
+          </w:tcPr>
+          <w:p>
+            <w:r>
+              <w:rPr>
+                <w:sz w:val="19"/>
+              </w:rPr>
+              <w:t>-0.151 [-0.232, -0.080]</w:t>
+            </w:r>
+          </w:p>
+        </w:tc>
+      </w:tr>
+      <w:tr>
+        <w:tc>
+          <w:tcPr>
+            <w:tcW w:type="dxa" w:w="864"/>
+          </w:tcPr>
+          <w:p>
+            <w:r>
+              <w:rPr>
+                <w:sz w:val="19"/>
+              </w:rPr>
+              <w:t>Dorsal</w:t>
+            </w:r>
+          </w:p>
+        </w:tc>
+        <w:tc>
+          <w:tcPr>
+            <w:tcW w:type="dxa" w:w="864"/>
+          </w:tcPr>
+          <w:p>
+            <w:r>
+              <w:rPr>
+                <w:sz w:val="19"/>
+              </w:rPr>
+              <w:t>size</w:t>
+            </w:r>
+          </w:p>
+        </w:tc>
+        <w:tc>
+          <w:tcPr>
+            <w:tcW w:type="dxa" w:w="576"/>
+          </w:tcPr>
+          <w:p>
+            <w:r>
+              <w:rPr>
+                <w:sz w:val="19"/>
+              </w:rPr>
+              <w:t>146</w:t>
+            </w:r>
+          </w:p>
+        </w:tc>
+        <w:tc>
+          <w:tcPr>
+            <w:tcW w:type="dxa" w:w="864"/>
+          </w:tcPr>
+          <w:p>
+            <w:r>
+              <w:rPr>
+                <w:sz w:val="19"/>
+              </w:rPr>
+              <w:t>15</w:t>
+            </w:r>
+          </w:p>
+        </w:tc>
+        <w:tc>
+          <w:tcPr>
+            <w:tcW w:type="dxa" w:w="2016"/>
+          </w:tcPr>
+          <w:p>
+            <w:r>
+              <w:rPr>
+                <w:sz w:val="19"/>
+              </w:rPr>
+              <w:t>0.013 [0.000, 0.084]</w:t>
+            </w:r>
+          </w:p>
+        </w:tc>
+        <w:tc>
+          <w:tcPr>
+            <w:tcW w:type="dxa" w:w="2016"/>
+          </w:tcPr>
+          <w:p>
+            <w:r>
+              <w:rPr>
+                <w:sz w:val="19"/>
+              </w:rPr>
+              <w:t>0.138 [0.000, 0.328]</w:t>
+            </w:r>
+          </w:p>
+        </w:tc>
+        <w:tc>
+          <w:tcPr>
+            <w:tcW w:type="dxa" w:w="2160"/>
+          </w:tcPr>
+          <w:p>
+            <w:r>
+              <w:rPr>
+                <w:sz w:val="19"/>
+              </w:rPr>
+              <w:t>0.115 [-0.042, 0.311]</w:t>
+            </w:r>
+          </w:p>
+        </w:tc>
+      </w:tr>
+    </w:tbl>
+    <w:p>
+      <w:r>
+        <w:rPr>
+          <w:b w:val="0"/>
+          <w:i/>
+          <w:sz w:val="18"/>
+        </w:rPr>
+        <w:t>Values are the between-family share of variance (intraclass correlation).</w:t>
+      </w:r>
+    </w:p>
+    <w:tbl>
+      <w:tblPr>
+        <w:tblStyle w:val="TableGrid"/>
+        <w:tblW w:type="auto" w:w="0"/>
+        <w:jc w:val="center"/>
+        <w:tblLook w:firstColumn="1" w:firstRow="1" w:lastColumn="0" w:lastRow="0" w:noHBand="0" w:noVBand="1" w:val="04A0"/>
+      </w:tblPr>
+      <w:tblGrid>
+        <w:gridCol w:w="2340"/>
+        <w:gridCol w:w="2340"/>
+        <w:gridCol w:w="2340"/>
+        <w:gridCol w:w="2340"/>
+      </w:tblGrid>
+      <w:tr>
+        <w:tc>
+          <w:tcPr>
+            <w:tcW w:type="dxa" w:w="1008"/>
+            <w:shd w:val="clear" w:color="auto" w:fill="D9E2F3"/>
+          </w:tcPr>
+          <w:p>
+            <w:r>
+              <w:rPr>
+                <w:sz w:val="19"/>
+              </w:rPr>
+            </w:r>
+            <w:r>
+              <w:rPr>
+                <w:b/>
+                <w:sz w:val="19"/>
+              </w:rPr>
+              <w:t>Face</w:t>
+            </w:r>
+          </w:p>
+        </w:tc>
+        <w:tc>
+          <w:tcPr>
+            <w:tcW w:type="dxa" w:w="4320"/>
+            <w:shd w:val="clear" w:color="auto" w:fill="D9E2F3"/>
+          </w:tcPr>
+          <w:p>
+            <w:r>
+              <w:rPr>
+                <w:sz w:val="19"/>
+              </w:rPr>
+            </w:r>
+            <w:r>
+              <w:rPr>
+                <w:b/>
+                <w:sz w:val="19"/>
+              </w:rPr>
+              <w:t>Region</w:t>
+            </w:r>
+          </w:p>
+        </w:tc>
+        <w:tc>
+          <w:tcPr>
+            <w:tcW w:type="dxa" w:w="1296"/>
+            <w:shd w:val="clear" w:color="auto" w:fill="D9E2F3"/>
+          </w:tcPr>
+          <w:p>
+            <w:r>
+              <w:rPr>
+                <w:sz w:val="19"/>
+              </w:rPr>
+            </w:r>
+            <w:r>
+              <w:rPr>
+                <w:b/>
+                <w:sz w:val="19"/>
+              </w:rPr>
+              <w:t>Protocol</w:t>
+            </w:r>
+          </w:p>
+        </w:tc>
+        <w:tc>
+          <w:tcPr>
+            <w:tcW w:type="dxa" w:w="2160"/>
+            <w:shd w:val="clear" w:color="auto" w:fill="D9E2F3"/>
+          </w:tcPr>
+          <w:p>
+            <w:r>
+              <w:rPr>
+                <w:sz w:val="19"/>
+              </w:rPr>
+            </w:r>
+            <w:r>
+              <w:rPr>
+                <w:b/>
+                <w:sz w:val="19"/>
+              </w:rPr>
+              <w:t>Between-family share</w:t>
+            </w:r>
+          </w:p>
+        </w:tc>
+      </w:tr>
+      <w:tr>
+        <w:tc>
+          <w:tcPr>
+            <w:tcW w:type="dxa" w:w="1008"/>
+          </w:tcPr>
+          <w:p>
+            <w:r>
+              <w:rPr>
+                <w:sz w:val="19"/>
+              </w:rPr>
+              <w:t>Dorsal</w:t>
+            </w:r>
+          </w:p>
+        </w:tc>
+        <w:tc>
+          <w:tcPr>
+            <w:tcW w:type="dxa" w:w="4320"/>
+          </w:tcPr>
+          <w:p>
+            <w:r>
+              <w:rPr>
+                <w:sz w:val="19"/>
+              </w:rPr>
+              <w:t>all</w:t>
+            </w:r>
+          </w:p>
+        </w:tc>
+        <w:tc>
+          <w:tcPr>
+            <w:tcW w:type="dxa" w:w="1296"/>
+          </w:tcPr>
+          <w:p>
+            <w:r>
+              <w:rPr>
+                <w:sz w:val="19"/>
+              </w:rPr>
+              <w:t>old</w:t>
+            </w:r>
+          </w:p>
+        </w:tc>
+        <w:tc>
+          <w:tcPr>
+            <w:tcW w:type="dxa" w:w="2160"/>
+          </w:tcPr>
+          <w:p>
+            <w:r>
+              <w:rPr>
+                <w:sz w:val="19"/>
+              </w:rPr>
+              <w:t>0.205</w:t>
+            </w:r>
+          </w:p>
+        </w:tc>
+      </w:tr>
+      <w:tr>
+        <w:tc>
+          <w:tcPr>
+            <w:tcW w:type="dxa" w:w="1008"/>
+          </w:tcPr>
+          <w:p>
+            <w:r>
+              <w:rPr>
+                <w:sz w:val="19"/>
+              </w:rPr>
+              <w:t>Dorsal</w:t>
+            </w:r>
+          </w:p>
+        </w:tc>
+        <w:tc>
+          <w:tcPr>
+            <w:tcW w:type="dxa" w:w="4320"/>
+          </w:tcPr>
+          <w:p>
+            <w:r>
+              <w:rPr>
+                <w:sz w:val="19"/>
+              </w:rPr>
+              <w:t>without split point 9</w:t>
+            </w:r>
+          </w:p>
+        </w:tc>
+        <w:tc>
+          <w:tcPr>
+            <w:tcW w:type="dxa" w:w="1296"/>
+          </w:tcPr>
+          <w:p>
+            <w:r>
+              <w:rPr>
+                <w:sz w:val="19"/>
+              </w:rPr>
+              <w:t>old</w:t>
+            </w:r>
+          </w:p>
+        </w:tc>
+        <w:tc>
+          <w:tcPr>
+            <w:tcW w:type="dxa" w:w="2160"/>
+          </w:tcPr>
+          <w:p>
+            <w:r>
+              <w:rPr>
+                <w:sz w:val="19"/>
+              </w:rPr>
+              <w:t>0.116</w:t>
+            </w:r>
+          </w:p>
+        </w:tc>
+      </w:tr>
+      <w:tr>
+        <w:tc>
+          <w:tcPr>
+            <w:tcW w:type="dxa" w:w="1008"/>
+          </w:tcPr>
+          <w:p>
+            <w:r>
+              <w:rPr>
+                <w:sz w:val="19"/>
+              </w:rPr>
+              <w:t>Dorsal</w:t>
+            </w:r>
+          </w:p>
+        </w:tc>
+        <w:tc>
+          <w:tcPr>
+            <w:tcW w:type="dxa" w:w="4320"/>
+          </w:tcPr>
+          <w:p>
+            <w:r>
+              <w:rPr>
+                <w:sz w:val="19"/>
+              </w:rPr>
+              <w:t>without fork cluster 6-12</w:t>
+            </w:r>
+          </w:p>
+        </w:tc>
+        <w:tc>
+          <w:tcPr>
+            <w:tcW w:type="dxa" w:w="1296"/>
+          </w:tcPr>
+          <w:p>
+            <w:r>
+              <w:rPr>
+                <w:sz w:val="19"/>
+              </w:rPr>
+              <w:t>old</w:t>
+            </w:r>
+          </w:p>
+        </w:tc>
+        <w:tc>
+          <w:tcPr>
+            <w:tcW w:type="dxa" w:w="2160"/>
+          </w:tcPr>
+          <w:p>
+            <w:r>
+              <w:rPr>
+                <w:sz w:val="19"/>
+              </w:rPr>
+              <w:t>0.122</w:t>
+            </w:r>
+          </w:p>
+        </w:tc>
+      </w:tr>
+      <w:tr>
+        <w:tc>
+          <w:tcPr>
+            <w:tcW w:type="dxa" w:w="1008"/>
+          </w:tcPr>
+          <w:p>
+            <w:r>
+              <w:rPr>
+                <w:sz w:val="19"/>
+              </w:rPr>
+              <w:t>Dorsal</w:t>
+            </w:r>
+          </w:p>
+        </w:tc>
+        <w:tc>
+          <w:tcPr>
+            <w:tcW w:type="dxa" w:w="4320"/>
+          </w:tcPr>
+          <w:p>
+            <w:r>
+              <w:rPr>
+                <w:sz w:val="19"/>
+              </w:rPr>
+              <w:t>fork cluster 6-12 only</w:t>
+            </w:r>
+          </w:p>
+        </w:tc>
+        <w:tc>
+          <w:tcPr>
+            <w:tcW w:type="dxa" w:w="1296"/>
+          </w:tcPr>
+          <w:p>
+            <w:r>
+              <w:rPr>
+                <w:sz w:val="19"/>
+              </w:rPr>
+              <w:t>old</w:t>
+            </w:r>
+          </w:p>
+        </w:tc>
+        <w:tc>
+          <w:tcPr>
+            <w:tcW w:type="dxa" w:w="2160"/>
+          </w:tcPr>
+          <w:p>
+            <w:r>
+              <w:rPr>
+                <w:sz w:val="19"/>
+              </w:rPr>
+              <w:t>0.222</w:t>
+            </w:r>
+          </w:p>
+        </w:tc>
+      </w:tr>
+      <w:tr>
+        <w:tc>
+          <w:tcPr>
+            <w:tcW w:type="dxa" w:w="1008"/>
+          </w:tcPr>
+          <w:p>
+            <w:r>
+              <w:rPr>
+                <w:sz w:val="19"/>
+              </w:rPr>
+              <w:t>Dorsal</w:t>
+            </w:r>
+          </w:p>
+        </w:tc>
+        <w:tc>
+          <w:tcPr>
+            <w:tcW w:type="dxa" w:w="4320"/>
+          </w:tcPr>
+          <w:p>
+            <w:r>
+              <w:rPr>
+                <w:sz w:val="19"/>
+              </w:rPr>
+              <w:t>tips + sutures (shared region)</w:t>
+            </w:r>
+          </w:p>
+        </w:tc>
+        <w:tc>
+          <w:tcPr>
+            <w:tcW w:type="dxa" w:w="1296"/>
+          </w:tcPr>
+          <w:p>
+            <w:r>
+              <w:rPr>
+                <w:sz w:val="19"/>
+              </w:rPr>
+              <w:t>new</w:t>
+            </w:r>
+          </w:p>
+        </w:tc>
+        <w:tc>
+          <w:tcPr>
+            <w:tcW w:type="dxa" w:w="2160"/>
+          </w:tcPr>
+          <w:p>
+            <w:r>
+              <w:rPr>
+                <w:sz w:val="19"/>
+              </w:rPr>
+              <w:t>0.166</w:t>
+            </w:r>
+          </w:p>
+        </w:tc>
+      </w:tr>
+      <w:tr>
+        <w:tc>
+          <w:tcPr>
+            <w:tcW w:type="dxa" w:w="1008"/>
+          </w:tcPr>
+          <w:p>
+            <w:r>
+              <w:rPr>
+                <w:sz w:val="19"/>
+              </w:rPr>
+              <w:t>Dorsal</w:t>
+            </w:r>
+          </w:p>
+        </w:tc>
+        <w:tc>
+          <w:tcPr>
+            <w:tcW w:type="dxa" w:w="4320"/>
+          </w:tcPr>
+          <w:p>
+            <w:r>
+              <w:rPr>
+                <w:sz w:val="19"/>
+              </w:rPr>
+              <w:t>sutures + apices only</w:t>
+            </w:r>
+          </w:p>
+        </w:tc>
+        <w:tc>
+          <w:tcPr>
+            <w:tcW w:type="dxa" w:w="1296"/>
+          </w:tcPr>
+          <w:p>
+            <w:r>
+              <w:rPr>
+                <w:sz w:val="19"/>
+              </w:rPr>
+              <w:t>old</w:t>
+            </w:r>
+          </w:p>
+        </w:tc>
+        <w:tc>
+          <w:tcPr>
+            <w:tcW w:type="dxa" w:w="2160"/>
+          </w:tcPr>
+          <w:p>
+            <w:r>
+              <w:rPr>
+                <w:sz w:val="19"/>
+              </w:rPr>
+              <w:t>0.122</w:t>
+            </w:r>
+          </w:p>
+        </w:tc>
+      </w:tr>
+      <w:tr>
+        <w:tc>
+          <w:tcPr>
+            <w:tcW w:type="dxa" w:w="1008"/>
+          </w:tcPr>
+          <w:p>
+            <w:r>
+              <w:rPr>
+                <w:sz w:val="19"/>
+              </w:rPr>
+              <w:t>Dorsal</w:t>
+            </w:r>
+          </w:p>
+        </w:tc>
+        <w:tc>
+          <w:tcPr>
+            <w:tcW w:type="dxa" w:w="4320"/>
+          </w:tcPr>
+          <w:p>
+            <w:r>
+              <w:rPr>
+                <w:sz w:val="19"/>
+              </w:rPr>
+              <w:t>sutures + apices only</w:t>
+            </w:r>
+          </w:p>
+        </w:tc>
+        <w:tc>
+          <w:tcPr>
+            <w:tcW w:type="dxa" w:w="1296"/>
+          </w:tcPr>
+          <w:p>
+            <w:r>
+              <w:rPr>
+                <w:sz w:val="19"/>
+              </w:rPr>
+              <w:t>new</w:t>
+            </w:r>
+          </w:p>
+        </w:tc>
+        <w:tc>
+          <w:tcPr>
+            <w:tcW w:type="dxa" w:w="2160"/>
+          </w:tcPr>
+          <w:p>
+            <w:r>
+              <w:rPr>
+                <w:sz w:val="19"/>
+              </w:rPr>
+              <w:t>0.117</w:t>
+            </w:r>
+          </w:p>
+        </w:tc>
+      </w:tr>
+      <w:tr>
+        <w:tc>
+          <w:tcPr>
+            <w:tcW w:type="dxa" w:w="1008"/>
+          </w:tcPr>
+          <w:p>
+            <w:r>
+              <w:rPr>
+                <w:sz w:val="19"/>
+              </w:rPr>
+              <w:t>Dorsal</w:t>
+            </w:r>
+          </w:p>
+        </w:tc>
+        <w:tc>
+          <w:tcPr>
+            <w:tcW w:type="dxa" w:w="4320"/>
+          </w:tcPr>
+          <w:p>
+            <w:r>
+              <w:rPr>
+                <w:sz w:val="19"/>
+              </w:rPr>
+              <w:t>shaft + shoulders + notch</w:t>
+            </w:r>
+          </w:p>
+        </w:tc>
+        <w:tc>
+          <w:tcPr>
+            <w:tcW w:type="dxa" w:w="1296"/>
+          </w:tcPr>
+          <w:p>
+            <w:r>
+              <w:rPr>
+                <w:sz w:val="19"/>
+              </w:rPr>
+              <w:t>new</w:t>
+            </w:r>
+          </w:p>
+        </w:tc>
+        <w:tc>
+          <w:tcPr>
+            <w:tcW w:type="dxa" w:w="2160"/>
+          </w:tcPr>
+          <w:p>
+            <w:r>
+              <w:rPr>
+                <w:sz w:val="19"/>
+              </w:rPr>
+              <w:t>0.041</w:t>
+            </w:r>
+          </w:p>
+        </w:tc>
+      </w:tr>
+      <w:tr>
+        <w:tc>
+          <w:tcPr>
+            <w:tcW w:type="dxa" w:w="1008"/>
+          </w:tcPr>
+          <w:p>
+            <w:r>
+              <w:rPr>
+                <w:sz w:val="19"/>
+              </w:rPr>
+              <w:t>Left</w:t>
+            </w:r>
+          </w:p>
+        </w:tc>
+        <w:tc>
+          <w:tcPr>
+            <w:tcW w:type="dxa" w:w="4320"/>
+          </w:tcPr>
+          <w:p>
+            <w:r>
+              <w:rPr>
+                <w:sz w:val="19"/>
+              </w:rPr>
+              <w:t>all</w:t>
+            </w:r>
+          </w:p>
+        </w:tc>
+        <w:tc>
+          <w:tcPr>
+            <w:tcW w:type="dxa" w:w="1296"/>
+          </w:tcPr>
+          <w:p>
+            <w:r>
+              <w:rPr>
+                <w:sz w:val="19"/>
+              </w:rPr>
+              <w:t>old</w:t>
+            </w:r>
+          </w:p>
+        </w:tc>
+        <w:tc>
+          <w:tcPr>
+            <w:tcW w:type="dxa" w:w="2160"/>
+          </w:tcPr>
+          <w:p>
+            <w:r>
+              <w:rPr>
+                <w:sz w:val="19"/>
+              </w:rPr>
+              <w:t>0.097</w:t>
+            </w:r>
+          </w:p>
+        </w:tc>
+      </w:tr>
+      <w:tr>
+        <w:tc>
+          <w:tcPr>
+            <w:tcW w:type="dxa" w:w="1008"/>
+          </w:tcPr>
+          <w:p>
+            <w:r>
+              <w:rPr>
+                <w:sz w:val="19"/>
+              </w:rPr>
+              <w:t>Left</w:t>
+            </w:r>
+          </w:p>
+        </w:tc>
+        <w:tc>
+          <w:tcPr>
+            <w:tcW w:type="dxa" w:w="4320"/>
+          </w:tcPr>
+          <w:p>
+            <w:r>
+              <w:rPr>
+                <w:sz w:val="19"/>
+              </w:rPr>
+              <w:t>heel (old 1-3 / new heel)</w:t>
+            </w:r>
+          </w:p>
+        </w:tc>
+        <w:tc>
+          <w:tcPr>
+            <w:tcW w:type="dxa" w:w="1296"/>
+          </w:tcPr>
+          <w:p>
+            <w:r>
+              <w:rPr>
+                <w:sz w:val="19"/>
+              </w:rPr>
+              <w:t>old</w:t>
+            </w:r>
+          </w:p>
+        </w:tc>
+        <w:tc>
+          <w:tcPr>
+            <w:tcW w:type="dxa" w:w="2160"/>
+          </w:tcPr>
+          <w:p>
+            <w:r>
+              <w:rPr>
+                <w:sz w:val="19"/>
+              </w:rPr>
+              <w:t>0.099</w:t>
+            </w:r>
+          </w:p>
+        </w:tc>
+      </w:tr>
+      <w:tr>
+        <w:tc>
+          <w:tcPr>
+            <w:tcW w:type="dxa" w:w="1008"/>
+          </w:tcPr>
+          <w:p>
+            <w:r>
+              <w:rPr>
+                <w:sz w:val="19"/>
+              </w:rPr>
+              <w:t>Left</w:t>
+            </w:r>
+          </w:p>
+        </w:tc>
+        <w:tc>
+          <w:tcPr>
+            <w:tcW w:type="dxa" w:w="4320"/>
+          </w:tcPr>
+          <w:p>
+            <w:r>
+              <w:rPr>
+                <w:sz w:val="19"/>
+              </w:rPr>
+              <w:t>heel (old 1-3 / new heel)</w:t>
+            </w:r>
+          </w:p>
+        </w:tc>
+        <w:tc>
+          <w:tcPr>
+            <w:tcW w:type="dxa" w:w="1296"/>
+          </w:tcPr>
+          <w:p>
+            <w:r>
+              <w:rPr>
+                <w:sz w:val="19"/>
+              </w:rPr>
+              <w:t>new</w:t>
+            </w:r>
+          </w:p>
+        </w:tc>
+        <w:tc>
+          <w:tcPr>
+            <w:tcW w:type="dxa" w:w="2160"/>
+          </w:tcPr>
+          <w:p>
+            <w:r>
+              <w:rPr>
+                <w:sz w:val="19"/>
+              </w:rPr>
+              <w:t>0</w:t>
+            </w:r>
+          </w:p>
+        </w:tc>
+      </w:tr>
+      <w:tr>
+        <w:tc>
+          <w:tcPr>
+            <w:tcW w:type="dxa" w:w="1008"/>
+          </w:tcPr>
+          <w:p>
+            <w:r>
+              <w:rPr>
+                <w:sz w:val="19"/>
+              </w:rPr>
+              <w:t>Left</w:t>
+            </w:r>
+          </w:p>
+        </w:tc>
+        <w:tc>
+          <w:tcPr>
+            <w:tcW w:type="dxa" w:w="4320"/>
+          </w:tcPr>
+          <w:p>
+            <w:r>
+              <w:rPr>
+                <w:sz w:val="19"/>
+              </w:rPr>
+              <w:t>ventral margin + sutures</w:t>
+            </w:r>
+          </w:p>
+        </w:tc>
+        <w:tc>
+          <w:tcPr>
+            <w:tcW w:type="dxa" w:w="1296"/>
+          </w:tcPr>
+          <w:p>
+            <w:r>
+              <w:rPr>
+                <w:sz w:val="19"/>
+              </w:rPr>
+              <w:t>old</w:t>
+            </w:r>
+          </w:p>
+        </w:tc>
+        <w:tc>
+          <w:tcPr>
+            <w:tcW w:type="dxa" w:w="2160"/>
+          </w:tcPr>
+          <w:p>
+            <w:r>
+              <w:rPr>
+                <w:sz w:val="19"/>
+              </w:rPr>
+              <w:t>0.056</w:t>
+            </w:r>
+          </w:p>
+        </w:tc>
+      </w:tr>
+      <w:tr>
+        <w:tc>
+          <w:tcPr>
+            <w:tcW w:type="dxa" w:w="1008"/>
+          </w:tcPr>
+          <w:p>
+            <w:r>
+              <w:rPr>
+                <w:sz w:val="19"/>
+              </w:rPr>
+              <w:t>Left</w:t>
+            </w:r>
+          </w:p>
+        </w:tc>
+        <w:tc>
+          <w:tcPr>
+            <w:tcW w:type="dxa" w:w="4320"/>
+          </w:tcPr>
+          <w:p>
+            <w:r>
+              <w:rPr>
+                <w:sz w:val="19"/>
+              </w:rPr>
+              <w:t>ventral margin + sutures</w:t>
+            </w:r>
+          </w:p>
+        </w:tc>
+        <w:tc>
+          <w:tcPr>
+            <w:tcW w:type="dxa" w:w="1296"/>
+          </w:tcPr>
+          <w:p>
+            <w:r>
+              <w:rPr>
+                <w:sz w:val="19"/>
+              </w:rPr>
+              <w:t>new</w:t>
+            </w:r>
+          </w:p>
+        </w:tc>
+        <w:tc>
+          <w:tcPr>
+            <w:tcW w:type="dxa" w:w="2160"/>
+          </w:tcPr>
+          <w:p>
+            <w:r>
+              <w:rPr>
+                <w:sz w:val="19"/>
+              </w:rPr>
+              <w:t>0.056</w:t>
+            </w:r>
+          </w:p>
+        </w:tc>
+      </w:tr>
+      <w:tr>
+        <w:tc>
+          <w:tcPr>
+            <w:tcW w:type="dxa" w:w="1008"/>
+          </w:tcPr>
+          <w:p>
+            <w:r>
+              <w:rPr>
+                <w:sz w:val="19"/>
+              </w:rPr>
+              <w:t>Left</w:t>
+            </w:r>
+          </w:p>
+        </w:tc>
+        <w:tc>
+          <w:tcPr>
+            <w:tcW w:type="dxa" w:w="4320"/>
+          </w:tcPr>
+          <w:p>
+            <w:r>
+              <w:rPr>
+                <w:sz w:val="19"/>
+              </w:rPr>
+              <w:t>window</w:t>
+            </w:r>
+          </w:p>
+        </w:tc>
+        <w:tc>
+          <w:tcPr>
+            <w:tcW w:type="dxa" w:w="1296"/>
+          </w:tcPr>
+          <w:p>
+            <w:r>
+              <w:rPr>
+                <w:sz w:val="19"/>
+              </w:rPr>
+              <w:t>old</w:t>
+            </w:r>
+          </w:p>
+        </w:tc>
+        <w:tc>
+          <w:tcPr>
+            <w:tcW w:type="dxa" w:w="2160"/>
+          </w:tcPr>
+          <w:p>
+            <w:r>
+              <w:rPr>
+                <w:sz w:val="19"/>
+              </w:rPr>
+              <w:t>0.031</w:t>
+            </w:r>
+          </w:p>
+        </w:tc>
+      </w:tr>
+      <w:tr>
+        <w:tc>
+          <w:tcPr>
+            <w:tcW w:type="dxa" w:w="1008"/>
+          </w:tcPr>
+          <w:p>
+            <w:r>
+              <w:rPr>
+                <w:sz w:val="19"/>
+              </w:rPr>
+              <w:t>Left</w:t>
+            </w:r>
+          </w:p>
+        </w:tc>
+        <w:tc>
+          <w:tcPr>
+            <w:tcW w:type="dxa" w:w="4320"/>
+          </w:tcPr>
+          <w:p>
+            <w:r>
+              <w:rPr>
+                <w:sz w:val="19"/>
+              </w:rPr>
+              <w:t>window</w:t>
+            </w:r>
+          </w:p>
+        </w:tc>
+        <w:tc>
+          <w:tcPr>
+            <w:tcW w:type="dxa" w:w="1296"/>
+          </w:tcPr>
+          <w:p>
+            <w:r>
+              <w:rPr>
+                <w:sz w:val="19"/>
+              </w:rPr>
+              <w:t>new</w:t>
+            </w:r>
+          </w:p>
+        </w:tc>
+        <w:tc>
+          <w:tcPr>
+            <w:tcW w:type="dxa" w:w="2160"/>
+          </w:tcPr>
+          <w:p>
+            <w:r>
+              <w:rPr>
+                <w:sz w:val="19"/>
+              </w:rPr>
+              <w:t>0.034</w:t>
+            </w:r>
+          </w:p>
+        </w:tc>
+      </w:tr>
+      <w:tr>
+        <w:tc>
+          <w:tcPr>
+            <w:tcW w:type="dxa" w:w="1008"/>
+          </w:tcPr>
+          <w:p>
+            <w:r>
+              <w:rPr>
+                <w:sz w:val="19"/>
+              </w:rPr>
+              <w:t>Left</w:t>
+            </w:r>
+          </w:p>
+        </w:tc>
+        <w:tc>
+          <w:tcPr>
+            <w:tcW w:type="dxa" w:w="4320"/>
+          </w:tcPr>
+          <w:p>
+            <w:r>
+              <w:rPr>
+                <w:sz w:val="19"/>
+              </w:rPr>
+              <w:t>dorsal margin</w:t>
+            </w:r>
+          </w:p>
+        </w:tc>
+        <w:tc>
+          <w:tcPr>
+            <w:tcW w:type="dxa" w:w="1296"/>
+          </w:tcPr>
+          <w:p>
+            <w:r>
+              <w:rPr>
+                <w:sz w:val="19"/>
+              </w:rPr>
+              <w:t>old</w:t>
+            </w:r>
+          </w:p>
+        </w:tc>
+        <w:tc>
+          <w:tcPr>
+            <w:tcW w:type="dxa" w:w="2160"/>
+          </w:tcPr>
+          <w:p>
+            <w:r>
+              <w:rPr>
+                <w:sz w:val="19"/>
+              </w:rPr>
+              <w:t>0.061</w:t>
+            </w:r>
+          </w:p>
+        </w:tc>
+      </w:tr>
+      <w:tr>
+        <w:tc>
+          <w:tcPr>
+            <w:tcW w:type="dxa" w:w="1008"/>
+          </w:tcPr>
+          <w:p>
+            <w:r>
+              <w:rPr>
+                <w:sz w:val="19"/>
+              </w:rPr>
+              <w:t>Left</w:t>
+            </w:r>
+          </w:p>
+        </w:tc>
+        <w:tc>
+          <w:tcPr>
+            <w:tcW w:type="dxa" w:w="4320"/>
+          </w:tcPr>
+          <w:p>
+            <w:r>
+              <w:rPr>
+                <w:sz w:val="19"/>
+              </w:rPr>
+              <w:t>dorsal margin</w:t>
+            </w:r>
+          </w:p>
+        </w:tc>
+        <w:tc>
+          <w:tcPr>
+            <w:tcW w:type="dxa" w:w="1296"/>
+          </w:tcPr>
+          <w:p>
+            <w:r>
+              <w:rPr>
+                <w:sz w:val="19"/>
+              </w:rPr>
+              <w:t>new</w:t>
+            </w:r>
+          </w:p>
+        </w:tc>
+        <w:tc>
+          <w:tcPr>
+            <w:tcW w:type="dxa" w:w="2160"/>
+          </w:tcPr>
+          <w:p>
+            <w:r>
+              <w:rPr>
+                <w:sz w:val="19"/>
+              </w:rPr>
+              <w:t>0.036</w:t>
+            </w:r>
+          </w:p>
+        </w:tc>
+      </w:tr>
+      <w:tr>
+        <w:tc>
+          <w:tcPr>
+            <w:tcW w:type="dxa" w:w="1008"/>
+          </w:tcPr>
+          <w:p>
+            <w:r>
+              <w:rPr>
+                <w:sz w:val="19"/>
+              </w:rPr>
+              <w:t>Left</w:t>
+            </w:r>
+          </w:p>
+        </w:tc>
+        <w:tc>
+          <w:tcPr>
+            <w:tcW w:type="dxa" w:w="4320"/>
+          </w:tcPr>
+          <w:p>
+            <w:r>
+              <w:rPr>
+                <w:sz w:val="19"/>
+              </w:rPr>
+              <w:t>without heel</w:t>
+            </w:r>
+          </w:p>
+        </w:tc>
+        <w:tc>
+          <w:tcPr>
+            <w:tcW w:type="dxa" w:w="1296"/>
+          </w:tcPr>
+          <w:p>
+            <w:r>
+              <w:rPr>
+                <w:sz w:val="19"/>
+              </w:rPr>
+              <w:t>old</w:t>
+            </w:r>
+          </w:p>
+        </w:tc>
+        <w:tc>
+          <w:tcPr>
+            <w:tcW w:type="dxa" w:w="2160"/>
+          </w:tcPr>
+          <w:p>
+            <w:r>
+              <w:rPr>
+                <w:sz w:val="19"/>
+              </w:rPr>
+              <w:t>0.065</w:t>
+            </w:r>
+          </w:p>
+        </w:tc>
+      </w:tr>
+    </w:tbl>
+    <w:p>
+      <w:r>
+        <w:rPr>
+          <w:b w:val="0"/>
+          <w:i/>
+          <w:sz w:val="18"/>
+        </w:rPr>
+        <w:t>Each region superimposed on its own.</w:t>
+      </w:r>
+    </w:p>
+    <w:p>
+      <w:r>
+        <w:rPr>
+          <w:b/>
+          <w:i w:val="0"/>
+        </w:rPr>
+        <w:t>Result.</w:t>
+      </w:r>
+      <w:r>
+        <w:rPr>
+          <w:b w:val="0"/>
+          <w:i w:val="0"/>
+        </w:rPr>
+        <w:t xml:space="preserve"> The new protocol does not capture more sibling-family variation. Where the two protocols measure the same anatomy the same way, they capture the same amount (Dorsal sutures and apices 0.12 vs 0.12; Left ventral margin and sutures 0.056 vs 0.056; Left window 0.031 vs 0.034). The old protocol's higher whole-configuration values come almost entirely from its Dorsal fork cluster (removing the split point alone lowers the Dorsal value from 0.21 to 0.12) and its three heel points on the Left face; the new protocol's large Dorsal shaft/shoulder region shows little family resemblance (0.04) and dilutes its whole-configuration value.</w:t>
+      </w:r>
+    </w:p>
+    <w:p>
+      <w:r>
+        <w:rPr>
+          <w:b/>
+          <w:i w:val="0"/>
+        </w:rPr>
+        <w:t>Interpretation.</w:t>
+      </w:r>
+      <w:r>
+        <w:rPr>
+          <w:b w:val="0"/>
+          <w:i w:val="0"/>
+        </w:rPr>
+        <w:t xml:space="preserve"> The fork-cluster and heel points are the old protocol's least reliable points (Section 1 of the protocol document: their placement error runs along the outline). Their family resemblance could be real heritable variation that the new definitions miss, or a digitizing-batch effect: siblings were probably digitized together, and hand placement of an ambiguous point can differ systematically between batches or digitizers. These data cannot separate the two; digitizer and digitizing-date records, or a repeat-digitizing study, would.</w:t>
+      </w:r>
+    </w:p>
+    <w:p>
+      <w:pPr>
         <w:pStyle w:val="Heading1"/>
       </w:pPr>
       <w:r>
@@ -12772,6 +14645,25 @@
           <w:b/>
           <w:i w:val="0"/>
         </w:rPr>
+        <w:t>The new protocol has not been shown to detect more biological variation.</w:t>
+      </w:r>
+      <w:r>
+        <w:rPr>
+          <w:b w:val="0"/>
+          <w:i w:val="0"/>
+        </w:rPr>
+        <w:t xml:space="preserve"> It gives more repeatable automated measurement on the Dorsal face and parity on the lateral faces, but no gain in group separation or sibling-family resemblance (Sections 2 and 4.3). Its main demonstrated advantages are measurement quality and robustness under automation, not more biological signal.</w:t>
+      </w:r>
+    </w:p>
+    <w:p>
+      <w:pPr>
+        <w:pStyle w:val="ListBullet"/>
+      </w:pPr>
+      <w:r>
+        <w:rPr>
+          <w:b/>
+          <w:i w:val="0"/>
+        </w:rPr>
         <w:t>Next analyses:</w:t>
       </w:r>
       <w:r>
@@ -12779,7 +14671,7 @@
           <w:b w:val="0"/>
           <w:i w:val="0"/>
         </w:rPr>
-        <w:t xml:space="preserve"> re-run this comparison with the revised lateral scheme; extend predictions to all raw images (cross-validated, so every specimen is predicted by a model that never saw it); and, if possible, a small repeat-digitizing set to separate digitizer effects from biology.</w:t>
+        <w:t xml:space="preserve"> find out whether the old heel and fork-cluster family signal is biological (digitizer and digitizing-date records, or a small repeat-digitizing study); QTL mapping with both phenotype sets as the definitive test; re-run this comparison with the revised lateral scheme; extend predictions to all raw images (cross-validated, so every specimen is predicted by a model that never saw it); and, if possible, a small repeat-digitizing set to separate digitizer effects from biology.</w:t>
       </w:r>
     </w:p>
     <w:p>

</xml_diff>